<commit_message>
Mongo + API Flask
</commit_message>
<xml_diff>
--- a/Doc Projeto Int.1.docx
+++ b/Doc Projeto Int.1.docx
@@ -318,18 +318,15 @@
         <w:br w:type="textWrapping"/>
       </w:r>
       <w:r>
-        <w:t>- Estruturar uma arquitetura de armazenamento híbrida utilizando bancos relacionais e NoSQL para alta performance</w:t>
+        <w:t>- Estruturar e implementar uma arquitetura de armazenamento em nuvem com banco NoSQL orientado a documentos (MongoDB Atlas) como base operacional, deixando o cache em memória (Redis) e a camada relacional para BI previstos para o Projeto II.</w:t>
       </w:r>
       <w:r>
         <w:rPr>
           <w:rtl w:val="0"/>
           <w:lang w:val="pt-BR" w:bidi="pt-BR" w:eastAsia="pt-BR"/>
         </w:rPr>
-        <w:t>(futuramente Projeto II)</w:t>
       </w:r>
-      <w:r>
-        <w:t>.</w:t>
-      </w:r>
+      <w:r/>
     </w:p>
     <w:p>
       <w:pPr>
@@ -529,7 +526,7 @@
     </w:p>
     <w:p>
       <w:r>
-        <w:t>A arquitetura foi desenhada para otimização do tempo de resposta.</w:t>
+        <w:t>A arquitetura foi desenhada para otimização do tempo de resposta. Como banco operacional, adotou-se um NoSQL orientado a documentos — o MongoDB Atlas (serviço gerenciado em nuvem) —, adequado ao schema variável dos exports da academia e à escrita em lote de grandes volumes. A base completa (~71 mil parcelas de ~4,4 mil alunos) é carregada, já anonimizada (LGPD), na coleção 'parcelas'; a base agregada em nível de aluno, que alimenta o modelo, fica na coleção 'alunos'. Um cache em memória (Redis) para o risco mais recente por aluno está previsto para o Projeto II.</w:t>
       </w:r>
     </w:p>
     <w:p>
@@ -573,14 +570,13 @@
         <w:br w:type="textWrapping"/>
       </w:r>
       <w:r>
-        <w:t>- Banco de Dados: MongoDB e Redis</w:t>
+        <w:t>- Banco de Dados: MongoDB Atlas (NoSQL em nuvem), base operacional já implementada; Redis (cache em memória) previsto para o Projeto II</w:t>
       </w:r>
       <w:r>
         <w:rPr>
           <w:rtl w:val="0"/>
           <w:lang w:val="pt-BR" w:bidi="pt-BR" w:eastAsia="pt-BR"/>
         </w:rPr>
-        <w:t xml:space="preserve"> (Futuro Projeto II)</w:t>
       </w:r>
     </w:p>
     <w:p>
@@ -715,11 +711,9 @@
           <w:rtl w:val="0"/>
           <w:lang w:val="pt-BR" w:bidi="pt-BR" w:eastAsia="pt-BR"/>
         </w:rPr>
-        <w:t>D</w:t>
+        <w:t>Desenvolvimento de um pipeline automatizado de ingestão em tempo real, a adoção do cache em memória (Redis) para consultas de baixa latência e a expansão do uso do MongoDB Atlas para armazenar as interações de CRM de forma não relacional.</w:t>
       </w:r>
-      <w:r>
-        <w:t>esenvolvimento de um pipeline automatizado de ingestão de dados em tempo real para a plataforma em nuvem e a expansão do uso do MongoDB para armazenar interações do CRM de forma não relacional.</w:t>
-      </w:r>
+      <w:r/>
     </w:p>
     <w:sectPr>
       <w:type w:val="nextPage"/>

</xml_diff>